<commit_message>
se agrega la actualizacion de scrum
</commit_message>
<xml_diff>
--- a/Ingenieria de sofware/Scrum.docx
+++ b/Ingenieria de sofware/Scrum.docx
@@ -16,7 +16,7 @@
           <w:noProof/>
         </w:rPr>
         <w:drawing>
-          <wp:anchor distT="0" distB="0" distL="114300" distR="114300" simplePos="0" relativeHeight="251659264" behindDoc="1" locked="0" layoutInCell="1" allowOverlap="1" wp14:anchorId="4BE66E59" wp14:editId="174A1870">
+          <wp:anchor distT="0" distB="0" distL="114300" distR="114300" simplePos="0" relativeHeight="251658240" behindDoc="1" locked="0" layoutInCell="1" allowOverlap="1" wp14:anchorId="4BE66E59" wp14:editId="174A1870">
             <wp:simplePos x="0" y="0"/>
             <wp:positionH relativeFrom="margin">
               <wp:align>center</wp:align>
@@ -1859,7 +1859,6 @@
         </w:rPr>
         <w:t> </w:t>
       </w:r>
-      <w:proofErr w:type="spellStart"/>
       <w:r>
         <w:rPr>
           <w:rStyle w:val="Textoennegrita"/>
@@ -1868,18 +1867,7 @@
           <w:szCs w:val="21"/>
           <w:shd w:val="clear" w:color="auto" w:fill="FFFFFF"/>
         </w:rPr>
-        <w:t>Arguinzóniz</w:t>
-      </w:r>
-      <w:proofErr w:type="spellEnd"/>
-      <w:r>
-        <w:rPr>
-          <w:rStyle w:val="Textoennegrita"/>
-          <w:color w:val="333333"/>
-          <w:sz w:val="21"/>
-          <w:szCs w:val="21"/>
-          <w:shd w:val="clear" w:color="auto" w:fill="FFFFFF"/>
-        </w:rPr>
-        <w:t>, María de la Luz.</w:t>
+        <w:t>Arguinzóniz, María de la Luz.</w:t>
       </w:r>
       <w:r>
         <w:rPr>
@@ -1898,29 +1886,7 @@
           <w:szCs w:val="21"/>
           <w:shd w:val="clear" w:color="auto" w:fill="FFFFFF"/>
         </w:rPr>
-        <w:t xml:space="preserve">Guía de la </w:t>
-      </w:r>
-      <w:proofErr w:type="gramStart"/>
-      <w:r>
-        <w:rPr>
-          <w:rStyle w:val="nfasis"/>
-          <w:color w:val="333333"/>
-          <w:sz w:val="21"/>
-          <w:szCs w:val="21"/>
-          <w:shd w:val="clear" w:color="auto" w:fill="FFFFFF"/>
-        </w:rPr>
-        <w:t>biblioteca :</w:t>
-      </w:r>
-      <w:proofErr w:type="gramEnd"/>
-      <w:r>
-        <w:rPr>
-          <w:rStyle w:val="nfasis"/>
-          <w:color w:val="333333"/>
-          <w:sz w:val="21"/>
-          <w:szCs w:val="21"/>
-          <w:shd w:val="clear" w:color="auto" w:fill="FFFFFF"/>
-        </w:rPr>
-        <w:t xml:space="preserve"> funciones y actividades.</w:t>
+        <w:t>Guía de la biblioteca : funciones y actividades.</w:t>
       </w:r>
       <w:r>
         <w:rPr>
@@ -1978,87 +1944,7 @@
           <w:szCs w:val="20"/>
           <w:shd w:val="clear" w:color="auto" w:fill="FFFFFF"/>
         </w:rPr>
-        <w:t> (</w:t>
-      </w:r>
-      <w:proofErr w:type="spellStart"/>
-      <w:r>
-        <w:rPr>
-          <w:color w:val="222222"/>
-          <w:sz w:val="20"/>
-          <w:szCs w:val="20"/>
-          <w:shd w:val="clear" w:color="auto" w:fill="FFFFFF"/>
-        </w:rPr>
-        <w:t>Bachelor's</w:t>
-      </w:r>
-      <w:proofErr w:type="spellEnd"/>
-      <w:r>
-        <w:rPr>
-          <w:color w:val="222222"/>
-          <w:sz w:val="20"/>
-          <w:szCs w:val="20"/>
-          <w:shd w:val="clear" w:color="auto" w:fill="FFFFFF"/>
-        </w:rPr>
-        <w:t xml:space="preserve"> </w:t>
-      </w:r>
-      <w:proofErr w:type="spellStart"/>
-      <w:r>
-        <w:rPr>
-          <w:color w:val="222222"/>
-          <w:sz w:val="20"/>
-          <w:szCs w:val="20"/>
-          <w:shd w:val="clear" w:color="auto" w:fill="FFFFFF"/>
-        </w:rPr>
-        <w:t>thesis</w:t>
-      </w:r>
-      <w:proofErr w:type="spellEnd"/>
-      <w:r>
-        <w:rPr>
-          <w:color w:val="222222"/>
-          <w:sz w:val="20"/>
-          <w:szCs w:val="20"/>
-          <w:shd w:val="clear" w:color="auto" w:fill="FFFFFF"/>
-        </w:rPr>
-        <w:t xml:space="preserve">, Universidad Estatal de Bolívar. Facultad de Ciencias Administrativas, Gestión Empresarial e Informática. Carrera de </w:t>
-      </w:r>
-      <w:proofErr w:type="spellStart"/>
-      <w:r>
-        <w:rPr>
-          <w:color w:val="222222"/>
-          <w:sz w:val="20"/>
-          <w:szCs w:val="20"/>
-          <w:shd w:val="clear" w:color="auto" w:fill="FFFFFF"/>
-        </w:rPr>
-        <w:t>Bibliotecologia</w:t>
-      </w:r>
-      <w:proofErr w:type="spellEnd"/>
-      <w:r>
-        <w:rPr>
-          <w:color w:val="222222"/>
-          <w:sz w:val="20"/>
-          <w:szCs w:val="20"/>
-          <w:shd w:val="clear" w:color="auto" w:fill="FFFFFF"/>
-        </w:rPr>
-        <w:t xml:space="preserve"> </w:t>
-      </w:r>
-      <w:proofErr w:type="spellStart"/>
-      <w:r>
-        <w:rPr>
-          <w:color w:val="222222"/>
-          <w:sz w:val="20"/>
-          <w:szCs w:val="20"/>
-          <w:shd w:val="clear" w:color="auto" w:fill="FFFFFF"/>
-        </w:rPr>
-        <w:t>Documentologia</w:t>
-      </w:r>
-      <w:proofErr w:type="spellEnd"/>
-      <w:r>
-        <w:rPr>
-          <w:color w:val="222222"/>
-          <w:sz w:val="20"/>
-          <w:szCs w:val="20"/>
-          <w:shd w:val="clear" w:color="auto" w:fill="FFFFFF"/>
-        </w:rPr>
-        <w:t xml:space="preserve"> y Archivología).</w:t>
+        <w:t> (Bachelor's thesis, Universidad Estatal de Bolívar. Facultad de Ciencias Administrativas, Gestión Empresarial e Informática. Carrera de Bibliotecologia Documentologia y Archivología).</w:t>
       </w:r>
     </w:p>
     <w:p>
@@ -2431,10 +2317,8 @@
     </w:p>
     <w:tbl>
       <w:tblPr>
-        <w:tblStyle w:val="a"/>
         <w:tblpPr w:leftFromText="180" w:rightFromText="180" w:topFromText="180" w:bottomFromText="180" w:vertAnchor="text" w:horzAnchor="margin" w:tblpY="815"/>
         <w:tblW w:w="9000" w:type="dxa"/>
-        <w:tblInd w:w="0" w:type="dxa"/>
         <w:tblBorders>
           <w:top w:val="single" w:sz="8" w:space="0" w:color="000000"/>
           <w:left w:val="single" w:sz="8" w:space="0" w:color="000000"/>
@@ -2444,6 +2328,12 @@
           <w:insideV w:val="single" w:sz="8" w:space="0" w:color="000000"/>
         </w:tblBorders>
         <w:tblLayout w:type="fixed"/>
+        <w:tblCellMar>
+          <w:top w:w="100" w:type="dxa"/>
+          <w:left w:w="100" w:type="dxa"/>
+          <w:bottom w:w="100" w:type="dxa"/>
+          <w:right w:w="100" w:type="dxa"/>
+        </w:tblCellMar>
         <w:tblLook w:val="0600" w:firstRow="0" w:lastRow="0" w:firstColumn="0" w:lastColumn="0" w:noHBand="1" w:noVBand="1"/>
       </w:tblPr>
       <w:tblGrid>
@@ -3921,9 +3811,7 @@
     </w:p>
     <w:tbl>
       <w:tblPr>
-        <w:tblStyle w:val="a0"/>
         <w:tblW w:w="9029" w:type="dxa"/>
-        <w:tblInd w:w="0" w:type="dxa"/>
         <w:tblBorders>
           <w:top w:val="single" w:sz="8" w:space="0" w:color="000000"/>
           <w:left w:val="single" w:sz="8" w:space="0" w:color="000000"/>
@@ -3933,6 +3821,12 @@
           <w:insideV w:val="single" w:sz="8" w:space="0" w:color="000000"/>
         </w:tblBorders>
         <w:tblLayout w:type="fixed"/>
+        <w:tblCellMar>
+          <w:top w:w="100" w:type="dxa"/>
+          <w:left w:w="100" w:type="dxa"/>
+          <w:bottom w:w="100" w:type="dxa"/>
+          <w:right w:w="100" w:type="dxa"/>
+        </w:tblCellMar>
         <w:tblLook w:val="0600" w:firstRow="0" w:lastRow="0" w:firstColumn="0" w:lastColumn="0" w:noHBand="1" w:noVBand="1"/>
       </w:tblPr>
       <w:tblGrid>
@@ -4211,28 +4105,12 @@
                 <w:rFonts w:ascii="Trebuchet MS" w:hAnsi="Trebuchet MS"/>
               </w:rPr>
             </w:pPr>
-            <w:proofErr w:type="spellStart"/>
-            <w:r>
-              <w:rPr>
-                <w:rFonts w:ascii="Trebuchet MS" w:hAnsi="Trebuchet MS"/>
-              </w:rPr>
-              <w:t>Product</w:t>
-            </w:r>
-            <w:proofErr w:type="spellEnd"/>
-            <w:r>
-              <w:rPr>
-                <w:rFonts w:ascii="Trebuchet MS" w:hAnsi="Trebuchet MS"/>
-              </w:rPr>
-              <w:t xml:space="preserve"> </w:t>
-            </w:r>
-            <w:proofErr w:type="spellStart"/>
-            <w:r>
-              <w:rPr>
-                <w:rFonts w:ascii="Trebuchet MS" w:hAnsi="Trebuchet MS"/>
-              </w:rPr>
-              <w:t>Owner</w:t>
-            </w:r>
-            <w:proofErr w:type="spellEnd"/>
+            <w:r>
+              <w:rPr>
+                <w:rFonts w:ascii="Trebuchet MS" w:hAnsi="Trebuchet MS"/>
+              </w:rPr>
+              <w:t>Product Owner</w:t>
+            </w:r>
           </w:p>
           <w:p>
             <w:pPr>
@@ -4361,28 +4239,12 @@
                 <w:rFonts w:ascii="Trebuchet MS" w:hAnsi="Trebuchet MS"/>
               </w:rPr>
             </w:pPr>
-            <w:proofErr w:type="spellStart"/>
-            <w:r>
-              <w:rPr>
-                <w:rFonts w:ascii="Trebuchet MS" w:hAnsi="Trebuchet MS"/>
-              </w:rPr>
-              <w:t>Development</w:t>
-            </w:r>
-            <w:proofErr w:type="spellEnd"/>
-            <w:r>
-              <w:rPr>
-                <w:rFonts w:ascii="Trebuchet MS" w:hAnsi="Trebuchet MS"/>
-              </w:rPr>
-              <w:t xml:space="preserve"> </w:t>
-            </w:r>
-            <w:proofErr w:type="spellStart"/>
-            <w:r>
-              <w:rPr>
-                <w:rFonts w:ascii="Trebuchet MS" w:hAnsi="Trebuchet MS"/>
-              </w:rPr>
-              <w:t>Team</w:t>
-            </w:r>
-            <w:proofErr w:type="spellEnd"/>
+            <w:r>
+              <w:rPr>
+                <w:rFonts w:ascii="Trebuchet MS" w:hAnsi="Trebuchet MS"/>
+              </w:rPr>
+              <w:t>Development Team</w:t>
+            </w:r>
           </w:p>
           <w:p>
             <w:pPr>
@@ -4447,21 +4309,7 @@
               <w:rPr>
                 <w:rFonts w:ascii="Trebuchet MS" w:hAnsi="Trebuchet MS"/>
               </w:rPr>
-              <w:t xml:space="preserve">Jhon </w:t>
-            </w:r>
-            <w:proofErr w:type="spellStart"/>
-            <w:r>
-              <w:rPr>
-                <w:rFonts w:ascii="Trebuchet MS" w:hAnsi="Trebuchet MS"/>
-              </w:rPr>
-              <w:t>kenneth</w:t>
-            </w:r>
-            <w:proofErr w:type="spellEnd"/>
-            <w:r>
-              <w:rPr>
-                <w:rFonts w:ascii="Trebuchet MS" w:hAnsi="Trebuchet MS"/>
-              </w:rPr>
-              <w:t xml:space="preserve"> Fonseca Pineda</w:t>
+              <w:t>Jhon kenneth Fonseca Pineda</w:t>
             </w:r>
           </w:p>
           <w:p>
@@ -4536,14 +4384,12 @@
                 <w:rFonts w:ascii="Trebuchet MS" w:hAnsi="Trebuchet MS"/>
               </w:rPr>
             </w:pPr>
-            <w:proofErr w:type="spellStart"/>
             <w:r>
               <w:rPr>
                 <w:rFonts w:ascii="Trebuchet MS" w:hAnsi="Trebuchet MS"/>
               </w:rPr>
               <w:t>Stakeholders</w:t>
             </w:r>
-            <w:proofErr w:type="spellEnd"/>
           </w:p>
           <w:p>
             <w:pPr>
@@ -4783,10 +4629,8 @@
     </w:p>
     <w:tbl>
       <w:tblPr>
-        <w:tblStyle w:val="a2"/>
         <w:tblpPr w:leftFromText="180" w:rightFromText="180" w:topFromText="180" w:bottomFromText="180" w:vertAnchor="text"/>
         <w:tblW w:w="8880" w:type="dxa"/>
-        <w:tblInd w:w="0" w:type="dxa"/>
         <w:tblBorders>
           <w:top w:val="nil"/>
           <w:left w:val="nil"/>
@@ -4796,6 +4640,12 @@
           <w:insideV w:val="nil"/>
         </w:tblBorders>
         <w:tblLayout w:type="fixed"/>
+        <w:tblCellMar>
+          <w:top w:w="100" w:type="dxa"/>
+          <w:left w:w="100" w:type="dxa"/>
+          <w:bottom w:w="100" w:type="dxa"/>
+          <w:right w:w="100" w:type="dxa"/>
+        </w:tblCellMar>
         <w:tblLook w:val="0600" w:firstRow="0" w:lastRow="0" w:firstColumn="0" w:lastColumn="0" w:noHBand="1" w:noVBand="1"/>
       </w:tblPr>
       <w:tblGrid>
@@ -5504,10 +5354,8 @@
     </w:p>
     <w:tbl>
       <w:tblPr>
-        <w:tblStyle w:val="a3"/>
         <w:tblpPr w:leftFromText="180" w:rightFromText="180" w:topFromText="180" w:bottomFromText="180" w:vertAnchor="text"/>
         <w:tblW w:w="8880" w:type="dxa"/>
-        <w:tblInd w:w="0" w:type="dxa"/>
         <w:tblBorders>
           <w:top w:val="nil"/>
           <w:left w:val="nil"/>
@@ -5517,6 +5365,12 @@
           <w:insideV w:val="nil"/>
         </w:tblBorders>
         <w:tblLayout w:type="fixed"/>
+        <w:tblCellMar>
+          <w:top w:w="100" w:type="dxa"/>
+          <w:left w:w="100" w:type="dxa"/>
+          <w:bottom w:w="100" w:type="dxa"/>
+          <w:right w:w="100" w:type="dxa"/>
+        </w:tblCellMar>
         <w:tblLook w:val="0600" w:firstRow="0" w:lastRow="0" w:firstColumn="0" w:lastColumn="0" w:noHBand="1" w:noVBand="1"/>
       </w:tblPr>
       <w:tblGrid>
@@ -5721,25 +5575,7 @@
                 <w:sz w:val="24"/>
                 <w:szCs w:val="24"/>
               </w:rPr>
-              <w:t>Agregar</w:t>
-            </w:r>
-            <w:proofErr w:type="gramStart"/>
-            <w:r>
-              <w:rPr>
-                <w:rFonts w:ascii="Trebuchet MS" w:eastAsia="Times New Roman" w:hAnsi="Trebuchet MS" w:cs="Times New Roman"/>
-                <w:sz w:val="24"/>
-                <w:szCs w:val="24"/>
-              </w:rPr>
-              <w:t>, ,</w:t>
-            </w:r>
-            <w:proofErr w:type="gramEnd"/>
-            <w:r>
-              <w:rPr>
-                <w:rFonts w:ascii="Trebuchet MS" w:eastAsia="Times New Roman" w:hAnsi="Trebuchet MS" w:cs="Times New Roman"/>
-                <w:sz w:val="24"/>
-                <w:szCs w:val="24"/>
-              </w:rPr>
-              <w:t xml:space="preserve"> actualizar y eliminar usuario (Bibliotecario)</w:t>
+              <w:t>Agregar, , actualizar y eliminar usuario (Bibliotecario)</w:t>
             </w:r>
           </w:p>
           <w:p>
@@ -6295,10 +6131,8 @@
     </w:p>
     <w:tbl>
       <w:tblPr>
-        <w:tblStyle w:val="a4"/>
         <w:tblpPr w:leftFromText="180" w:rightFromText="180" w:topFromText="180" w:bottomFromText="180" w:vertAnchor="text"/>
         <w:tblW w:w="8880" w:type="dxa"/>
-        <w:tblInd w:w="0" w:type="dxa"/>
         <w:tblBorders>
           <w:top w:val="nil"/>
           <w:left w:val="nil"/>
@@ -6308,6 +6142,12 @@
           <w:insideV w:val="nil"/>
         </w:tblBorders>
         <w:tblLayout w:type="fixed"/>
+        <w:tblCellMar>
+          <w:top w:w="100" w:type="dxa"/>
+          <w:left w:w="100" w:type="dxa"/>
+          <w:bottom w:w="100" w:type="dxa"/>
+          <w:right w:w="100" w:type="dxa"/>
+        </w:tblCellMar>
         <w:tblLook w:val="0600" w:firstRow="0" w:lastRow="0" w:firstColumn="0" w:lastColumn="0" w:noHBand="1" w:noVBand="1"/>
       </w:tblPr>
       <w:tblGrid>
@@ -6514,25 +6354,7 @@
                 <w:sz w:val="24"/>
                 <w:szCs w:val="24"/>
               </w:rPr>
-              <w:t>Agregar</w:t>
-            </w:r>
-            <w:proofErr w:type="gramStart"/>
-            <w:r>
-              <w:rPr>
-                <w:rFonts w:ascii="Trebuchet MS" w:eastAsia="Times New Roman" w:hAnsi="Trebuchet MS" w:cs="Times New Roman"/>
-                <w:sz w:val="24"/>
-                <w:szCs w:val="24"/>
-              </w:rPr>
-              <w:t>, ,</w:t>
-            </w:r>
-            <w:proofErr w:type="gramEnd"/>
-            <w:r>
-              <w:rPr>
-                <w:rFonts w:ascii="Trebuchet MS" w:eastAsia="Times New Roman" w:hAnsi="Trebuchet MS" w:cs="Times New Roman"/>
-                <w:sz w:val="24"/>
-                <w:szCs w:val="24"/>
-              </w:rPr>
-              <w:t xml:space="preserve"> actualizar y eliminar libros (Bibliotecario)</w:t>
+              <w:t>Agregar, , actualizar y eliminar libros (Bibliotecario)</w:t>
             </w:r>
           </w:p>
           <w:p>
@@ -6621,36 +6443,8 @@
                 <w:sz w:val="24"/>
                 <w:szCs w:val="24"/>
               </w:rPr>
-              <w:t xml:space="preserve">Llevar un </w:t>
-            </w:r>
-            <w:proofErr w:type="gramStart"/>
-            <w:r>
-              <w:rPr>
-                <w:rFonts w:ascii="Trebuchet MS" w:eastAsia="Times New Roman" w:hAnsi="Trebuchet MS" w:cs="Times New Roman"/>
-                <w:sz w:val="24"/>
-                <w:szCs w:val="24"/>
-              </w:rPr>
-              <w:t>control  y</w:t>
-            </w:r>
-            <w:proofErr w:type="gramEnd"/>
-            <w:r>
-              <w:rPr>
-                <w:rFonts w:ascii="Trebuchet MS" w:eastAsia="Times New Roman" w:hAnsi="Trebuchet MS" w:cs="Times New Roman"/>
-                <w:sz w:val="24"/>
-                <w:szCs w:val="24"/>
-              </w:rPr>
-              <w:t xml:space="preserve">  mantener actualizado el inventario de los </w:t>
-            </w:r>
-            <w:proofErr w:type="spellStart"/>
-            <w:r>
-              <w:rPr>
-                <w:rFonts w:ascii="Trebuchet MS" w:eastAsia="Times New Roman" w:hAnsi="Trebuchet MS" w:cs="Times New Roman"/>
-                <w:sz w:val="24"/>
-                <w:szCs w:val="24"/>
-              </w:rPr>
-              <w:t>l;ibros</w:t>
-            </w:r>
-            <w:proofErr w:type="spellEnd"/>
+              <w:t>Llevar un control  y  mantener actualizado el inventario de los l;ibros</w:t>
+            </w:r>
           </w:p>
         </w:tc>
       </w:tr>
@@ -7098,10 +6892,8 @@
     </w:p>
     <w:tbl>
       <w:tblPr>
-        <w:tblStyle w:val="a5"/>
         <w:tblpPr w:leftFromText="180" w:rightFromText="180" w:topFromText="180" w:bottomFromText="180" w:vertAnchor="text"/>
         <w:tblW w:w="8880" w:type="dxa"/>
-        <w:tblInd w:w="0" w:type="dxa"/>
         <w:tblBorders>
           <w:top w:val="nil"/>
           <w:left w:val="nil"/>
@@ -7111,6 +6903,12 @@
           <w:insideV w:val="nil"/>
         </w:tblBorders>
         <w:tblLayout w:type="fixed"/>
+        <w:tblCellMar>
+          <w:top w:w="100" w:type="dxa"/>
+          <w:left w:w="100" w:type="dxa"/>
+          <w:bottom w:w="100" w:type="dxa"/>
+          <w:right w:w="100" w:type="dxa"/>
+        </w:tblCellMar>
         <w:tblLook w:val="0600" w:firstRow="0" w:lastRow="0" w:firstColumn="0" w:lastColumn="0" w:noHBand="1" w:noVBand="1"/>
       </w:tblPr>
       <w:tblGrid>
@@ -7407,25 +7205,7 @@
                 <w:sz w:val="24"/>
                 <w:szCs w:val="24"/>
               </w:rPr>
-              <w:t xml:space="preserve">Llevar un </w:t>
-            </w:r>
-            <w:proofErr w:type="gramStart"/>
-            <w:r>
-              <w:rPr>
-                <w:rFonts w:ascii="Trebuchet MS" w:eastAsia="Times New Roman" w:hAnsi="Trebuchet MS" w:cs="Times New Roman"/>
-                <w:sz w:val="24"/>
-                <w:szCs w:val="24"/>
-              </w:rPr>
-              <w:t>control  y</w:t>
-            </w:r>
-            <w:proofErr w:type="gramEnd"/>
-            <w:r>
-              <w:rPr>
-                <w:rFonts w:ascii="Trebuchet MS" w:eastAsia="Times New Roman" w:hAnsi="Trebuchet MS" w:cs="Times New Roman"/>
-                <w:sz w:val="24"/>
-                <w:szCs w:val="24"/>
-              </w:rPr>
-              <w:t xml:space="preserve"> seguimientos de los prestamos</w:t>
+              <w:t>Llevar un control  y seguimientos de los prestamos</w:t>
             </w:r>
           </w:p>
         </w:tc>
@@ -7502,41 +7282,13 @@
                 <w:szCs w:val="24"/>
               </w:rPr>
             </w:pPr>
-            <w:proofErr w:type="spellStart"/>
-            <w:r>
-              <w:rPr>
-                <w:rFonts w:ascii="Trebuchet MS" w:eastAsia="Times New Roman" w:hAnsi="Trebuchet MS" w:cs="Times New Roman"/>
-                <w:sz w:val="24"/>
-                <w:szCs w:val="24"/>
-              </w:rPr>
-              <w:t>Vericar</w:t>
-            </w:r>
-            <w:proofErr w:type="spellEnd"/>
-            <w:r>
-              <w:rPr>
-                <w:rFonts w:ascii="Trebuchet MS" w:eastAsia="Times New Roman" w:hAnsi="Trebuchet MS" w:cs="Times New Roman"/>
-                <w:sz w:val="24"/>
-                <w:szCs w:val="24"/>
-              </w:rPr>
-              <w:t xml:space="preserve"> que los reportes muestren </w:t>
-            </w:r>
-            <w:proofErr w:type="spellStart"/>
-            <w:r>
-              <w:rPr>
-                <w:rFonts w:ascii="Trebuchet MS" w:eastAsia="Times New Roman" w:hAnsi="Trebuchet MS" w:cs="Times New Roman"/>
-                <w:sz w:val="24"/>
-                <w:szCs w:val="24"/>
-              </w:rPr>
-              <w:t>informacion</w:t>
-            </w:r>
-            <w:proofErr w:type="spellEnd"/>
-            <w:r>
-              <w:rPr>
-                <w:rFonts w:ascii="Trebuchet MS" w:eastAsia="Times New Roman" w:hAnsi="Trebuchet MS" w:cs="Times New Roman"/>
-                <w:sz w:val="24"/>
-                <w:szCs w:val="24"/>
-              </w:rPr>
-              <w:t xml:space="preserve"> real.</w:t>
+            <w:r>
+              <w:rPr>
+                <w:rFonts w:ascii="Trebuchet MS" w:eastAsia="Times New Roman" w:hAnsi="Trebuchet MS" w:cs="Times New Roman"/>
+                <w:sz w:val="24"/>
+                <w:szCs w:val="24"/>
+              </w:rPr>
+              <w:t>Vericar que los reportes muestren informacion real.</w:t>
             </w:r>
           </w:p>
         </w:tc>
@@ -7879,10 +7631,8 @@
     </w:p>
     <w:tbl>
       <w:tblPr>
-        <w:tblStyle w:val="a6"/>
         <w:tblpPr w:leftFromText="180" w:rightFromText="180" w:topFromText="180" w:bottomFromText="180" w:vertAnchor="text"/>
         <w:tblW w:w="8880" w:type="dxa"/>
-        <w:tblInd w:w="0" w:type="dxa"/>
         <w:tblBorders>
           <w:top w:val="nil"/>
           <w:left w:val="nil"/>
@@ -7892,6 +7642,12 @@
           <w:insideV w:val="nil"/>
         </w:tblBorders>
         <w:tblLayout w:type="fixed"/>
+        <w:tblCellMar>
+          <w:top w:w="100" w:type="dxa"/>
+          <w:left w:w="100" w:type="dxa"/>
+          <w:bottom w:w="100" w:type="dxa"/>
+          <w:right w:w="100" w:type="dxa"/>
+        </w:tblCellMar>
         <w:tblLook w:val="0600" w:firstRow="0" w:lastRow="0" w:firstColumn="0" w:lastColumn="0" w:noHBand="1" w:noVBand="1"/>
       </w:tblPr>
       <w:tblGrid>
@@ -8093,25 +7849,13 @@
                 <w:szCs w:val="24"/>
               </w:rPr>
             </w:pPr>
-            <w:proofErr w:type="spellStart"/>
-            <w:proofErr w:type="gramStart"/>
-            <w:r>
-              <w:rPr>
-                <w:rFonts w:ascii="Trebuchet MS" w:eastAsia="Times New Roman" w:hAnsi="Trebuchet MS" w:cs="Times New Roman"/>
-                <w:sz w:val="24"/>
-                <w:szCs w:val="24"/>
-              </w:rPr>
-              <w:t>Agregar,actualizar</w:t>
-            </w:r>
-            <w:proofErr w:type="spellEnd"/>
-            <w:proofErr w:type="gramEnd"/>
-            <w:r>
-              <w:rPr>
-                <w:rFonts w:ascii="Trebuchet MS" w:eastAsia="Times New Roman" w:hAnsi="Trebuchet MS" w:cs="Times New Roman"/>
-                <w:sz w:val="24"/>
-                <w:szCs w:val="24"/>
-              </w:rPr>
-              <w:t xml:space="preserve"> y eliminar estudiantes</w:t>
+            <w:r>
+              <w:rPr>
+                <w:rFonts w:ascii="Trebuchet MS" w:eastAsia="Times New Roman" w:hAnsi="Trebuchet MS" w:cs="Times New Roman"/>
+                <w:sz w:val="24"/>
+                <w:szCs w:val="24"/>
+              </w:rPr>
+              <w:t>Agregar,actualizar y eliminar estudiantes</w:t>
             </w:r>
           </w:p>
           <w:p>
@@ -8283,25 +8027,7 @@
                 <w:sz w:val="24"/>
                 <w:szCs w:val="24"/>
               </w:rPr>
-              <w:t xml:space="preserve">Validar que el número de estudiantes sea único y que no </w:t>
-            </w:r>
-            <w:proofErr w:type="spellStart"/>
-            <w:r>
-              <w:rPr>
-                <w:rFonts w:ascii="Trebuchet MS" w:eastAsia="Times New Roman" w:hAnsi="Trebuchet MS" w:cs="Times New Roman"/>
-                <w:sz w:val="24"/>
-                <w:szCs w:val="24"/>
-              </w:rPr>
-              <w:t>este</w:t>
-            </w:r>
-            <w:proofErr w:type="spellEnd"/>
-            <w:r>
-              <w:rPr>
-                <w:rFonts w:ascii="Trebuchet MS" w:eastAsia="Times New Roman" w:hAnsi="Trebuchet MS" w:cs="Times New Roman"/>
-                <w:sz w:val="24"/>
-                <w:szCs w:val="24"/>
-              </w:rPr>
-              <w:t xml:space="preserve"> duplicado.</w:t>
+              <w:t>Validar que el número de estudiantes sea único y que no este duplicado.</w:t>
             </w:r>
           </w:p>
           <w:p>
@@ -8324,36 +8050,8 @@
                 <w:sz w:val="24"/>
                 <w:szCs w:val="24"/>
               </w:rPr>
-              <w:t xml:space="preserve">Verificar que todos los campos </w:t>
-            </w:r>
-            <w:proofErr w:type="spellStart"/>
-            <w:r>
-              <w:rPr>
-                <w:rFonts w:ascii="Trebuchet MS" w:eastAsia="Times New Roman" w:hAnsi="Trebuchet MS" w:cs="Times New Roman"/>
-                <w:sz w:val="24"/>
-                <w:szCs w:val="24"/>
-              </w:rPr>
-              <w:t>esten</w:t>
-            </w:r>
-            <w:proofErr w:type="spellEnd"/>
-            <w:r>
-              <w:rPr>
-                <w:rFonts w:ascii="Trebuchet MS" w:eastAsia="Times New Roman" w:hAnsi="Trebuchet MS" w:cs="Times New Roman"/>
-                <w:sz w:val="24"/>
-                <w:szCs w:val="24"/>
-              </w:rPr>
-              <w:t xml:space="preserve"> </w:t>
-            </w:r>
-            <w:proofErr w:type="gramStart"/>
-            <w:r>
-              <w:rPr>
-                <w:rFonts w:ascii="Trebuchet MS" w:eastAsia="Times New Roman" w:hAnsi="Trebuchet MS" w:cs="Times New Roman"/>
-                <w:sz w:val="24"/>
-                <w:szCs w:val="24"/>
-              </w:rPr>
-              <w:t>completos..</w:t>
-            </w:r>
-            <w:proofErr w:type="gramEnd"/>
+              <w:t>Verificar que todos los campos esten completos..</w:t>
+            </w:r>
           </w:p>
           <w:p>
             <w:pPr>
@@ -8718,10 +8416,8 @@
     </w:p>
     <w:tbl>
       <w:tblPr>
-        <w:tblStyle w:val="a7"/>
         <w:tblpPr w:leftFromText="180" w:rightFromText="180" w:topFromText="180" w:bottomFromText="180" w:vertAnchor="text"/>
         <w:tblW w:w="9045" w:type="dxa"/>
-        <w:tblInd w:w="0" w:type="dxa"/>
         <w:tblBorders>
           <w:top w:val="nil"/>
           <w:left w:val="nil"/>
@@ -8731,6 +8427,12 @@
           <w:insideV w:val="nil"/>
         </w:tblBorders>
         <w:tblLayout w:type="fixed"/>
+        <w:tblCellMar>
+          <w:top w:w="100" w:type="dxa"/>
+          <w:left w:w="100" w:type="dxa"/>
+          <w:bottom w:w="100" w:type="dxa"/>
+          <w:right w:w="100" w:type="dxa"/>
+        </w:tblCellMar>
         <w:tblLook w:val="0600" w:firstRow="0" w:lastRow="0" w:firstColumn="0" w:lastColumn="0" w:noHBand="1" w:noVBand="1"/>
       </w:tblPr>
       <w:tblGrid>
@@ -9500,10 +9202,8 @@
     </w:p>
     <w:tbl>
       <w:tblPr>
-        <w:tblStyle w:val="a8"/>
         <w:tblpPr w:leftFromText="180" w:rightFromText="180" w:topFromText="180" w:bottomFromText="180" w:vertAnchor="text"/>
         <w:tblW w:w="9045" w:type="dxa"/>
-        <w:tblInd w:w="0" w:type="dxa"/>
         <w:tblBorders>
           <w:top w:val="nil"/>
           <w:left w:val="nil"/>
@@ -9513,6 +9213,12 @@
           <w:insideV w:val="nil"/>
         </w:tblBorders>
         <w:tblLayout w:type="fixed"/>
+        <w:tblCellMar>
+          <w:top w:w="100" w:type="dxa"/>
+          <w:left w:w="100" w:type="dxa"/>
+          <w:bottom w:w="100" w:type="dxa"/>
+          <w:right w:w="100" w:type="dxa"/>
+        </w:tblCellMar>
         <w:tblLook w:val="0600" w:firstRow="0" w:lastRow="0" w:firstColumn="0" w:lastColumn="0" w:noHBand="1" w:noVBand="1"/>
       </w:tblPr>
       <w:tblGrid>
@@ -10316,10 +10022,8 @@
     </w:p>
     <w:tbl>
       <w:tblPr>
-        <w:tblStyle w:val="a9"/>
         <w:tblpPr w:leftFromText="180" w:rightFromText="180" w:topFromText="180" w:bottomFromText="180" w:vertAnchor="text"/>
         <w:tblW w:w="9045" w:type="dxa"/>
-        <w:tblInd w:w="0" w:type="dxa"/>
         <w:tblBorders>
           <w:top w:val="nil"/>
           <w:left w:val="nil"/>
@@ -10329,6 +10033,12 @@
           <w:insideV w:val="nil"/>
         </w:tblBorders>
         <w:tblLayout w:type="fixed"/>
+        <w:tblCellMar>
+          <w:top w:w="100" w:type="dxa"/>
+          <w:left w:w="100" w:type="dxa"/>
+          <w:bottom w:w="100" w:type="dxa"/>
+          <w:right w:w="100" w:type="dxa"/>
+        </w:tblCellMar>
         <w:tblLook w:val="0600" w:firstRow="0" w:lastRow="0" w:firstColumn="0" w:lastColumn="0" w:noHBand="1" w:noVBand="1"/>
       </w:tblPr>
       <w:tblGrid>
@@ -11124,10 +10834,8 @@
     </w:p>
     <w:tbl>
       <w:tblPr>
-        <w:tblStyle w:val="aa"/>
         <w:tblpPr w:leftFromText="180" w:rightFromText="180" w:topFromText="180" w:bottomFromText="180" w:vertAnchor="text"/>
         <w:tblW w:w="9045" w:type="dxa"/>
-        <w:tblInd w:w="0" w:type="dxa"/>
         <w:tblBorders>
           <w:top w:val="nil"/>
           <w:left w:val="nil"/>
@@ -11137,6 +10845,12 @@
           <w:insideV w:val="nil"/>
         </w:tblBorders>
         <w:tblLayout w:type="fixed"/>
+        <w:tblCellMar>
+          <w:top w:w="100" w:type="dxa"/>
+          <w:left w:w="100" w:type="dxa"/>
+          <w:bottom w:w="100" w:type="dxa"/>
+          <w:right w:w="100" w:type="dxa"/>
+        </w:tblCellMar>
         <w:tblLook w:val="0600" w:firstRow="0" w:lastRow="0" w:firstColumn="0" w:lastColumn="0" w:noHBand="1" w:noVBand="1"/>
       </w:tblPr>
       <w:tblGrid>
@@ -11353,25 +11067,7 @@
                 <w:sz w:val="24"/>
                 <w:szCs w:val="24"/>
               </w:rPr>
-              <w:t xml:space="preserve">Consultar todos los préstamos activos </w:t>
-            </w:r>
-            <w:proofErr w:type="spellStart"/>
-            <w:r>
-              <w:rPr>
-                <w:rFonts w:ascii="Trebuchet MS" w:eastAsia="Times New Roman" w:hAnsi="Trebuchet MS" w:cs="Times New Roman"/>
-                <w:sz w:val="24"/>
-                <w:szCs w:val="24"/>
-              </w:rPr>
-              <w:t>y</w:t>
-            </w:r>
-            <w:proofErr w:type="spellEnd"/>
-            <w:r>
-              <w:rPr>
-                <w:rFonts w:ascii="Trebuchet MS" w:eastAsia="Times New Roman" w:hAnsi="Trebuchet MS" w:cs="Times New Roman"/>
-                <w:sz w:val="24"/>
-                <w:szCs w:val="24"/>
-              </w:rPr>
-              <w:t xml:space="preserve"> históricos</w:t>
+              <w:t>Consultar todos los préstamos activos y históricos</w:t>
             </w:r>
           </w:p>
         </w:tc>
@@ -11924,10 +11620,8 @@
     </w:p>
     <w:tbl>
       <w:tblPr>
-        <w:tblStyle w:val="ab"/>
         <w:tblpPr w:leftFromText="180" w:rightFromText="180" w:topFromText="180" w:bottomFromText="180" w:vertAnchor="text"/>
         <w:tblW w:w="9045" w:type="dxa"/>
-        <w:tblInd w:w="0" w:type="dxa"/>
         <w:tblBorders>
           <w:top w:val="nil"/>
           <w:left w:val="nil"/>
@@ -11937,6 +11631,12 @@
           <w:insideV w:val="nil"/>
         </w:tblBorders>
         <w:tblLayout w:type="fixed"/>
+        <w:tblCellMar>
+          <w:top w:w="100" w:type="dxa"/>
+          <w:left w:w="100" w:type="dxa"/>
+          <w:bottom w:w="100" w:type="dxa"/>
+          <w:right w:w="100" w:type="dxa"/>
+        </w:tblCellMar>
         <w:tblLook w:val="0600" w:firstRow="0" w:lastRow="0" w:firstColumn="0" w:lastColumn="0" w:noHBand="1" w:noVBand="1"/>
       </w:tblPr>
       <w:tblGrid>
@@ -12689,18 +12389,8 @@
                 <w:sz w:val="24"/>
                 <w:szCs w:val="24"/>
               </w:rPr>
-              <w:t xml:space="preserve"> 5 </w:t>
-            </w:r>
-            <w:proofErr w:type="spellStart"/>
-            <w:r>
-              <w:rPr>
-                <w:rFonts w:ascii="Trebuchet MS" w:eastAsia="Times New Roman" w:hAnsi="Trebuchet MS" w:cs="Times New Roman"/>
-                <w:sz w:val="24"/>
-                <w:szCs w:val="24"/>
-              </w:rPr>
-              <w:t>horass</w:t>
-            </w:r>
-            <w:proofErr w:type="spellEnd"/>
+              <w:t xml:space="preserve"> 5 horass</w:t>
+            </w:r>
           </w:p>
         </w:tc>
       </w:tr>
@@ -12758,37 +12448,19 @@
           <w:szCs w:val="28"/>
         </w:rPr>
         <w:lastRenderedPageBreak/>
-        <w:t xml:space="preserve"> Formato de </w:t>
-      </w:r>
-      <w:proofErr w:type="spellStart"/>
-      <w:r>
-        <w:rPr>
-          <w:rFonts w:ascii="Trebuchet MS" w:eastAsia="Times New Roman" w:hAnsi="Trebuchet MS" w:cs="Times New Roman"/>
-          <w:b/>
-          <w:bCs/>
-          <w:sz w:val="28"/>
-          <w:szCs w:val="28"/>
-        </w:rPr>
-        <w:t>Product</w:t>
-      </w:r>
-      <w:proofErr w:type="spellEnd"/>
-      <w:r>
-        <w:rPr>
-          <w:rFonts w:ascii="Trebuchet MS" w:eastAsia="Times New Roman" w:hAnsi="Trebuchet MS" w:cs="Times New Roman"/>
-          <w:b/>
-          <w:bCs/>
-          <w:sz w:val="28"/>
-          <w:szCs w:val="28"/>
-        </w:rPr>
-        <w:t xml:space="preserve"> Backlog </w:t>
+        <w:t xml:space="preserve"> Formato de Product Backlog </w:t>
       </w:r>
     </w:p>
     <w:tbl>
       <w:tblPr>
-        <w:tblStyle w:val="ac"/>
         <w:tblW w:w="8445" w:type="dxa"/>
-        <w:tblInd w:w="0" w:type="dxa"/>
         <w:tblLayout w:type="fixed"/>
+        <w:tblCellMar>
+          <w:top w:w="15" w:type="dxa"/>
+          <w:left w:w="15" w:type="dxa"/>
+          <w:bottom w:w="15" w:type="dxa"/>
+          <w:right w:w="15" w:type="dxa"/>
+        </w:tblCellMar>
         <w:tblLook w:val="0400" w:firstRow="0" w:lastRow="0" w:firstColumn="0" w:lastColumn="0" w:noHBand="0" w:noVBand="1"/>
       </w:tblPr>
       <w:tblGrid>
@@ -13830,21 +13502,8 @@
                 <w:sz w:val="24"/>
                 <w:szCs w:val="24"/>
               </w:rPr>
-              <w:t xml:space="preserve">Registrar </w:t>
-            </w:r>
-            <w:proofErr w:type="spellStart"/>
-            <w:r>
-              <w:rPr>
-                <w:rFonts w:ascii="Trebuchet MS" w:eastAsia="Times New Roman" w:hAnsi="Trebuchet MS" w:cs="Times New Roman"/>
-                <w:b/>
-                <w:bCs/>
-                <w:color w:val="434343"/>
-                <w:sz w:val="24"/>
-                <w:szCs w:val="24"/>
-              </w:rPr>
-              <w:t>Esudiantes</w:t>
-            </w:r>
-            <w:proofErr w:type="spellEnd"/>
+              <w:t>Registrar Esudiantes</w:t>
+            </w:r>
           </w:p>
         </w:tc>
         <w:tc>
@@ -14944,6 +14603,13 @@
       </w:r>
     </w:p>
   </w:endnote>
+  <w:endnote w:type="continuationNotice" w:id="1">
+    <w:p>
+      <w:pPr>
+        <w:spacing w:line="240" w:lineRule="auto"/>
+      </w:pPr>
+    </w:p>
+  </w:endnote>
 </w:endnotes>
 </file>
 
@@ -14967,6 +14633,13 @@
       <w:r>
         <w:continuationSeparator/>
       </w:r>
+    </w:p>
+  </w:footnote>
+  <w:footnote w:type="continuationNotice" w:id="1">
+    <w:p>
+      <w:pPr>
+        <w:spacing w:line="240" w:lineRule="auto"/>
+      </w:pPr>
     </w:p>
   </w:footnote>
 </w:footnotes>
@@ -14985,7 +14658,7 @@
         <w:noProof/>
       </w:rPr>
       <w:drawing>
-        <wp:anchor distT="0" distB="0" distL="114300" distR="114300" simplePos="0" relativeHeight="251661312" behindDoc="1" locked="0" layoutInCell="1" allowOverlap="1" wp14:anchorId="0E3C355D" wp14:editId="0820C3C5">
+        <wp:anchor distT="0" distB="0" distL="114300" distR="114300" simplePos="0" relativeHeight="251658241" behindDoc="1" locked="0" layoutInCell="1" allowOverlap="1" wp14:anchorId="0E3C355D" wp14:editId="0820C3C5">
           <wp:simplePos x="0" y="0"/>
           <wp:positionH relativeFrom="margin">
             <wp:posOffset>-706755</wp:posOffset>
@@ -15054,7 +14727,7 @@
         <w:noProof/>
       </w:rPr>
       <w:drawing>
-        <wp:anchor distT="0" distB="0" distL="114300" distR="114300" simplePos="0" relativeHeight="251659264" behindDoc="1" locked="0" layoutInCell="1" allowOverlap="1" wp14:anchorId="7D95202C" wp14:editId="18875595">
+        <wp:anchor distT="0" distB="0" distL="114300" distR="114300" simplePos="0" relativeHeight="251658240" behindDoc="1" locked="0" layoutInCell="1" allowOverlap="1" wp14:anchorId="7D95202C" wp14:editId="18875595">
           <wp:simplePos x="0" y="0"/>
           <wp:positionH relativeFrom="margin">
             <wp:posOffset>-782955</wp:posOffset>
@@ -16475,8 +16148,6 @@
   <w:style w:type="table" w:default="1" w:styleId="Tablanormal">
     <w:name w:val="Normal Table"/>
     <w:uiPriority w:val="99"/>
-    <w:semiHidden/>
-    <w:unhideWhenUsed/>
     <w:tblPr>
       <w:tblInd w:w="0" w:type="dxa"/>
       <w:tblCellMar>

</xml_diff>